<commit_message>
feat: badges redactor and generation
</commit_message>
<xml_diff>
--- a/backend/templates/word/special_answer_blank_template.docx
+++ b/backend/templates/word/special_answer_blank_template.docx
@@ -16864,443 +16864,6 @@
               <w:top w:val="nil"/>
               <w:left w:val="nil"/>
               <w:bottom w:val="nil"/>
-              <w:right w:val="nil"/>
-            </w:tcBorders>
-          </w:tcPr>
-          <w:p/>
-        </w:tc>
-      </w:tr>
-      <w:tr>
-        <w:trPr>
-          <w:trHeight w:val="283"/>
-        </w:trPr>
-        <w:tc>
-          <w:tcPr>
-            <w:tcW w:w="283" w:type="dxa"/>
-            <w:tcBorders>
-              <w:top w:val="nil"/>
-              <w:left w:val="nil"/>
-              <w:bottom w:val="single" w:sz="4" w:space="0" w:color="auto"/>
-              <w:right w:val="nil"/>
-            </w:tcBorders>
-          </w:tcPr>
-          <w:p/>
-        </w:tc>
-        <w:tc>
-          <w:tcPr>
-            <w:tcW w:w="283" w:type="dxa"/>
-            <w:tcBorders>
-              <w:top w:val="nil"/>
-              <w:left w:val="nil"/>
-              <w:bottom w:val="single" w:sz="4" w:space="0" w:color="auto"/>
-              <w:right w:val="nil"/>
-            </w:tcBorders>
-          </w:tcPr>
-          <w:p/>
-        </w:tc>
-        <w:tc>
-          <w:tcPr>
-            <w:tcW w:w="283" w:type="dxa"/>
-            <w:tcBorders>
-              <w:top w:val="nil"/>
-              <w:left w:val="nil"/>
-              <w:bottom w:val="single" w:sz="4" w:space="0" w:color="auto"/>
-              <w:right w:val="nil"/>
-            </w:tcBorders>
-          </w:tcPr>
-          <w:p/>
-        </w:tc>
-        <w:tc>
-          <w:tcPr>
-            <w:tcW w:w="282" w:type="dxa"/>
-            <w:tcBorders>
-              <w:top w:val="nil"/>
-              <w:left w:val="nil"/>
-              <w:bottom w:val="single" w:sz="4" w:space="0" w:color="auto"/>
-              <w:right w:val="nil"/>
-            </w:tcBorders>
-          </w:tcPr>
-          <w:p/>
-        </w:tc>
-        <w:tc>
-          <w:tcPr>
-            <w:tcW w:w="288" w:type="dxa"/>
-            <w:tcBorders>
-              <w:top w:val="nil"/>
-              <w:left w:val="nil"/>
-              <w:bottom w:val="single" w:sz="4" w:space="0" w:color="auto"/>
-              <w:right w:val="nil"/>
-            </w:tcBorders>
-          </w:tcPr>
-          <w:p/>
-        </w:tc>
-        <w:tc>
-          <w:tcPr>
-            <w:tcW w:w="287" w:type="dxa"/>
-            <w:tcBorders>
-              <w:top w:val="nil"/>
-              <w:left w:val="nil"/>
-              <w:bottom w:val="single" w:sz="4" w:space="0" w:color="auto"/>
-              <w:right w:val="nil"/>
-            </w:tcBorders>
-          </w:tcPr>
-          <w:p/>
-        </w:tc>
-        <w:tc>
-          <w:tcPr>
-            <w:tcW w:w="287" w:type="dxa"/>
-            <w:tcBorders>
-              <w:top w:val="nil"/>
-              <w:left w:val="nil"/>
-              <w:bottom w:val="single" w:sz="4" w:space="0" w:color="auto"/>
-              <w:right w:val="nil"/>
-            </w:tcBorders>
-          </w:tcPr>
-          <w:p/>
-        </w:tc>
-        <w:tc>
-          <w:tcPr>
-            <w:tcW w:w="287" w:type="dxa"/>
-            <w:tcBorders>
-              <w:top w:val="nil"/>
-              <w:left w:val="nil"/>
-              <w:bottom w:val="single" w:sz="4" w:space="0" w:color="auto"/>
-              <w:right w:val="nil"/>
-            </w:tcBorders>
-          </w:tcPr>
-          <w:p/>
-        </w:tc>
-        <w:tc>
-          <w:tcPr>
-            <w:tcW w:w="275" w:type="dxa"/>
-            <w:tcBorders>
-              <w:top w:val="nil"/>
-              <w:left w:val="nil"/>
-              <w:bottom w:val="single" w:sz="4" w:space="0" w:color="auto"/>
-              <w:right w:val="nil"/>
-            </w:tcBorders>
-          </w:tcPr>
-          <w:p/>
-        </w:tc>
-        <w:tc>
-          <w:tcPr>
-            <w:tcW w:w="275" w:type="dxa"/>
-            <w:tcBorders>
-              <w:top w:val="nil"/>
-              <w:left w:val="nil"/>
-              <w:bottom w:val="single" w:sz="4" w:space="0" w:color="auto"/>
-              <w:right w:val="nil"/>
-            </w:tcBorders>
-          </w:tcPr>
-          <w:p/>
-        </w:tc>
-        <w:tc>
-          <w:tcPr>
-            <w:tcW w:w="275" w:type="dxa"/>
-            <w:tcBorders>
-              <w:top w:val="nil"/>
-              <w:left w:val="nil"/>
-              <w:bottom w:val="single" w:sz="4" w:space="0" w:color="auto"/>
-              <w:right w:val="nil"/>
-            </w:tcBorders>
-          </w:tcPr>
-          <w:p/>
-        </w:tc>
-        <w:tc>
-          <w:tcPr>
-            <w:tcW w:w="275" w:type="dxa"/>
-            <w:tcBorders>
-              <w:top w:val="nil"/>
-              <w:left w:val="nil"/>
-              <w:bottom w:val="single" w:sz="4" w:space="0" w:color="auto"/>
-              <w:right w:val="nil"/>
-            </w:tcBorders>
-          </w:tcPr>
-          <w:p/>
-        </w:tc>
-        <w:tc>
-          <w:tcPr>
-            <w:tcW w:w="275" w:type="dxa"/>
-            <w:tcBorders>
-              <w:top w:val="nil"/>
-              <w:left w:val="nil"/>
-              <w:bottom w:val="single" w:sz="4" w:space="0" w:color="auto"/>
-              <w:right w:val="nil"/>
-            </w:tcBorders>
-          </w:tcPr>
-          <w:p/>
-        </w:tc>
-        <w:tc>
-          <w:tcPr>
-            <w:tcW w:w="275" w:type="dxa"/>
-            <w:tcBorders>
-              <w:top w:val="nil"/>
-              <w:left w:val="nil"/>
-              <w:bottom w:val="single" w:sz="4" w:space="0" w:color="auto"/>
-              <w:right w:val="nil"/>
-            </w:tcBorders>
-          </w:tcPr>
-          <w:p/>
-        </w:tc>
-        <w:tc>
-          <w:tcPr>
-            <w:tcW w:w="275" w:type="dxa"/>
-            <w:tcBorders>
-              <w:top w:val="nil"/>
-              <w:left w:val="nil"/>
-              <w:bottom w:val="single" w:sz="4" w:space="0" w:color="auto"/>
-              <w:right w:val="nil"/>
-            </w:tcBorders>
-          </w:tcPr>
-          <w:p/>
-        </w:tc>
-        <w:tc>
-          <w:tcPr>
-            <w:tcW w:w="275" w:type="dxa"/>
-            <w:tcBorders>
-              <w:top w:val="nil"/>
-              <w:left w:val="nil"/>
-              <w:bottom w:val="single" w:sz="4" w:space="0" w:color="auto"/>
-              <w:right w:val="nil"/>
-            </w:tcBorders>
-          </w:tcPr>
-          <w:p/>
-        </w:tc>
-        <w:tc>
-          <w:tcPr>
-            <w:tcW w:w="275" w:type="dxa"/>
-            <w:tcBorders>
-              <w:top w:val="nil"/>
-              <w:left w:val="nil"/>
-              <w:bottom w:val="single" w:sz="4" w:space="0" w:color="auto"/>
-              <w:right w:val="nil"/>
-            </w:tcBorders>
-          </w:tcPr>
-          <w:p/>
-        </w:tc>
-        <w:tc>
-          <w:tcPr>
-            <w:tcW w:w="275" w:type="dxa"/>
-            <w:tcBorders>
-              <w:top w:val="nil"/>
-              <w:left w:val="nil"/>
-              <w:bottom w:val="single" w:sz="4" w:space="0" w:color="auto"/>
-              <w:right w:val="nil"/>
-            </w:tcBorders>
-          </w:tcPr>
-          <w:p/>
-        </w:tc>
-        <w:tc>
-          <w:tcPr>
-            <w:tcW w:w="275" w:type="dxa"/>
-            <w:tcBorders>
-              <w:top w:val="nil"/>
-              <w:left w:val="nil"/>
-              <w:bottom w:val="single" w:sz="4" w:space="0" w:color="auto"/>
-              <w:right w:val="nil"/>
-            </w:tcBorders>
-          </w:tcPr>
-          <w:p/>
-        </w:tc>
-        <w:tc>
-          <w:tcPr>
-            <w:tcW w:w="275" w:type="dxa"/>
-            <w:tcBorders>
-              <w:top w:val="nil"/>
-              <w:left w:val="nil"/>
-              <w:bottom w:val="single" w:sz="4" w:space="0" w:color="auto"/>
-              <w:right w:val="nil"/>
-            </w:tcBorders>
-          </w:tcPr>
-          <w:p/>
-        </w:tc>
-        <w:tc>
-          <w:tcPr>
-            <w:tcW w:w="275" w:type="dxa"/>
-            <w:tcBorders>
-              <w:top w:val="nil"/>
-              <w:left w:val="nil"/>
-              <w:bottom w:val="single" w:sz="4" w:space="0" w:color="auto"/>
-              <w:right w:val="nil"/>
-            </w:tcBorders>
-          </w:tcPr>
-          <w:p/>
-        </w:tc>
-        <w:tc>
-          <w:tcPr>
-            <w:tcW w:w="275" w:type="dxa"/>
-            <w:tcBorders>
-              <w:top w:val="nil"/>
-              <w:left w:val="nil"/>
-              <w:bottom w:val="single" w:sz="4" w:space="0" w:color="auto"/>
-              <w:right w:val="nil"/>
-            </w:tcBorders>
-          </w:tcPr>
-          <w:p/>
-        </w:tc>
-        <w:tc>
-          <w:tcPr>
-            <w:tcW w:w="275" w:type="dxa"/>
-            <w:tcBorders>
-              <w:top w:val="nil"/>
-              <w:left w:val="nil"/>
-              <w:bottom w:val="single" w:sz="4" w:space="0" w:color="auto"/>
-              <w:right w:val="nil"/>
-            </w:tcBorders>
-          </w:tcPr>
-          <w:p/>
-        </w:tc>
-        <w:tc>
-          <w:tcPr>
-            <w:tcW w:w="292" w:type="dxa"/>
-            <w:tcBorders>
-              <w:top w:val="nil"/>
-              <w:left w:val="nil"/>
-              <w:bottom w:val="single" w:sz="4" w:space="0" w:color="auto"/>
-              <w:right w:val="nil"/>
-            </w:tcBorders>
-          </w:tcPr>
-          <w:p/>
-        </w:tc>
-        <w:tc>
-          <w:tcPr>
-            <w:tcW w:w="292" w:type="dxa"/>
-            <w:tcBorders>
-              <w:top w:val="nil"/>
-              <w:left w:val="nil"/>
-              <w:bottom w:val="single" w:sz="4" w:space="0" w:color="auto"/>
-              <w:right w:val="nil"/>
-            </w:tcBorders>
-          </w:tcPr>
-          <w:p/>
-        </w:tc>
-        <w:tc>
-          <w:tcPr>
-            <w:tcW w:w="291" w:type="dxa"/>
-            <w:tcBorders>
-              <w:top w:val="nil"/>
-              <w:left w:val="nil"/>
-              <w:bottom w:val="single" w:sz="4" w:space="0" w:color="auto"/>
-              <w:right w:val="nil"/>
-            </w:tcBorders>
-          </w:tcPr>
-          <w:p/>
-        </w:tc>
-        <w:tc>
-          <w:tcPr>
-            <w:tcW w:w="291" w:type="dxa"/>
-            <w:tcBorders>
-              <w:top w:val="nil"/>
-              <w:left w:val="nil"/>
-              <w:bottom w:val="single" w:sz="4" w:space="0" w:color="auto"/>
-              <w:right w:val="nil"/>
-            </w:tcBorders>
-          </w:tcPr>
-          <w:p/>
-        </w:tc>
-        <w:tc>
-          <w:tcPr>
-            <w:tcW w:w="291" w:type="dxa"/>
-            <w:tcBorders>
-              <w:top w:val="nil"/>
-              <w:left w:val="nil"/>
-              <w:bottom w:val="single" w:sz="4" w:space="0" w:color="auto"/>
-              <w:right w:val="nil"/>
-            </w:tcBorders>
-          </w:tcPr>
-          <w:p/>
-        </w:tc>
-        <w:tc>
-          <w:tcPr>
-            <w:tcW w:w="275" w:type="dxa"/>
-            <w:tcBorders>
-              <w:top w:val="nil"/>
-              <w:left w:val="nil"/>
-              <w:bottom w:val="single" w:sz="4" w:space="0" w:color="auto"/>
-              <w:right w:val="nil"/>
-            </w:tcBorders>
-          </w:tcPr>
-          <w:p/>
-        </w:tc>
-        <w:tc>
-          <w:tcPr>
-            <w:tcW w:w="275" w:type="dxa"/>
-            <w:tcBorders>
-              <w:top w:val="nil"/>
-              <w:left w:val="nil"/>
-              <w:bottom w:val="single" w:sz="4" w:space="0" w:color="auto"/>
-              <w:right w:val="nil"/>
-            </w:tcBorders>
-          </w:tcPr>
-          <w:p/>
-        </w:tc>
-        <w:tc>
-          <w:tcPr>
-            <w:tcW w:w="296" w:type="dxa"/>
-            <w:tcBorders>
-              <w:top w:val="nil"/>
-              <w:left w:val="nil"/>
-              <w:bottom w:val="single" w:sz="4" w:space="0" w:color="auto"/>
-              <w:right w:val="nil"/>
-            </w:tcBorders>
-          </w:tcPr>
-          <w:p/>
-        </w:tc>
-        <w:tc>
-          <w:tcPr>
-            <w:tcW w:w="296" w:type="dxa"/>
-            <w:tcBorders>
-              <w:top w:val="nil"/>
-              <w:left w:val="nil"/>
-              <w:bottom w:val="single" w:sz="4" w:space="0" w:color="auto"/>
-              <w:right w:val="nil"/>
-            </w:tcBorders>
-          </w:tcPr>
-          <w:p/>
-        </w:tc>
-        <w:tc>
-          <w:tcPr>
-            <w:tcW w:w="296" w:type="dxa"/>
-            <w:tcBorders>
-              <w:top w:val="nil"/>
-              <w:left w:val="nil"/>
-              <w:bottom w:val="single" w:sz="4" w:space="0" w:color="auto"/>
-              <w:right w:val="nil"/>
-            </w:tcBorders>
-          </w:tcPr>
-          <w:p/>
-        </w:tc>
-        <w:tc>
-          <w:tcPr>
-            <w:tcW w:w="296" w:type="dxa"/>
-            <w:tcBorders>
-              <w:top w:val="nil"/>
-              <w:left w:val="nil"/>
-              <w:bottom w:val="single" w:sz="4" w:space="0" w:color="auto"/>
-              <w:right w:val="nil"/>
-            </w:tcBorders>
-          </w:tcPr>
-          <w:p/>
-        </w:tc>
-        <w:tc>
-          <w:tcPr>
-            <w:tcW w:w="296" w:type="dxa"/>
-            <w:tcBorders>
-              <w:top w:val="nil"/>
-              <w:left w:val="nil"/>
-              <w:bottom w:val="single" w:sz="4" w:space="0" w:color="auto"/>
-              <w:right w:val="nil"/>
-            </w:tcBorders>
-          </w:tcPr>
-          <w:p/>
-        </w:tc>
-        <w:tc>
-          <w:tcPr>
-            <w:tcW w:w="296" w:type="dxa"/>
-            <w:tcBorders>
-              <w:top w:val="nil"/>
-              <w:left w:val="nil"/>
-              <w:bottom w:val="single" w:sz="4" w:space="0" w:color="auto"/>
               <w:right w:val="nil"/>
             </w:tcBorders>
           </w:tcPr>

</xml_diff>